<commit_message>
Add LINE OA instructions to user manual
</commit_message>
<xml_diff>
--- a/public/downloads/DomainWatch-User-Manual-v2.1.docx
+++ b/public/downloads/DomainWatch-User-Manual-v2.1.docx
@@ -122,7 +122,7 @@
           <w:color w:val="64748B"/>
           <w:sz w:val="19"/>
         </w:rPr>
-        <w:t>ฉบับ 2.1 • 29 สิงหาคม 2569 • เอกสารสำหรับส่งมอบงาน</w:t>
+        <w:t>ฉบับ 2.2 • 30 สิงหาคม 2569 • เอกสารสำหรับส่งมอบงาน</w:t>
       </w:r>
     </w:p>
     <w:tbl>
@@ -1621,6 +1621,187 @@
     </w:p>
     <w:p>
       <w:pPr>
+        <w:pStyle w:val="Heading2"/>
+      </w:pPr>
+      <w:r>
+        <w:rPr>
+          <w:rFonts w:ascii="Kanit" w:hAnsi="Kanit" w:eastAsia="Kanit" w:cs="Kanit"/>
+        </w:rPr>
+        <w:t>ตรวจ LINE OA และดึงลิงก์จาก Rich Menu</w:t>
+      </w:r>
+    </w:p>
+    <w:p>
+      <w:pPr>
+        <w:pStyle w:val="ListNumber"/>
+      </w:pPr>
+      <w:r>
+        <w:rPr>
+          <w:rFonts w:ascii="Kanit" w:hAnsi="Kanit" w:eastAsia="Kanit" w:cs="Kanit"/>
+        </w:rPr>
+        <w:t>เข้า LINE Developers Console เลือก Provider และ Messaging API channel ของ OA จากแท็บ Messaging API ให้ออก Channel access token แล้วเก็บเป็นความลับ</w:t>
+      </w:r>
+    </w:p>
+    <w:p>
+      <w:pPr>
+        <w:pStyle w:val="ListNumber"/>
+      </w:pPr>
+      <w:r>
+        <w:rPr>
+          <w:rFonts w:ascii="Kanit" w:hAnsi="Kanit" w:eastAsia="Kanit" w:cs="Kanit"/>
+        </w:rPr>
+        <w:t>ใน DomainWatch ไปที่ บริษัท / ห้อง LINE กางบริษัท แล้วกด ⚙️ OA ที่ห้องเป้าหมาย</w:t>
+      </w:r>
+    </w:p>
+    <w:p>
+      <w:pPr>
+        <w:pStyle w:val="ListNumber"/>
+      </w:pPr>
+      <w:r>
+        <w:rPr>
+          <w:rFonts w:ascii="Kanit" w:hAnsi="Kanit" w:eastAsia="Kanit" w:cs="Kanit"/>
+        </w:rPr>
+        <w:t>วาง Channel Access Token กรอกชื่อ OA ที่คาดหวัง และกด บันทึก ก่อน</w:t>
+      </w:r>
+    </w:p>
+    <w:p>
+      <w:pPr>
+        <w:pStyle w:val="ListNumber"/>
+      </w:pPr>
+      <w:r>
+        <w:rPr>
+          <w:rFonts w:ascii="Kanit" w:hAnsi="Kanit" w:eastAsia="Kanit" w:cs="Kanit"/>
+        </w:rPr>
+        <w:t>กด ตรวจ OA ตอนนี้ เพื่อตรวจว่า token ใช้ได้ ชื่อบัญชีตรง และมีรูปโปรไฟล์หรือไม่</w:t>
+      </w:r>
+    </w:p>
+    <w:p>
+      <w:pPr>
+        <w:pStyle w:val="ListNumber"/>
+      </w:pPr>
+      <w:r>
+        <w:rPr>
+          <w:rFonts w:ascii="Kanit" w:hAnsi="Kanit" w:eastAsia="Kanit" w:cs="Kanit"/>
+        </w:rPr>
+        <w:t>กด ดึงลิงก์จาก Rich Menu ระบบจะเพิ่ม URL ใหม่ในห้องนั้นเป็นหมวด ริชเมนู และข้าม URL ที่มีอยู่แล้ว</w:t>
+      </w:r>
+    </w:p>
+    <w:p>
+      <w:pPr>
+        <w:pStyle w:val="ListNumber"/>
+      </w:pPr>
+      <w:r>
+        <w:rPr>
+          <w:rFonts w:ascii="Kanit" w:hAnsi="Kanit" w:eastAsia="Kanit" w:cs="Kanit"/>
+        </w:rPr>
+        <w:t>ไปที่ Master Data กรองบริษัทและห้อง ตรวจชื่อ URL สถานะเฝ้าดู และเติมลิงก์สำรองก่อนใช้งานจริง</w:t>
+      </w:r>
+    </w:p>
+    <w:tbl>
+      <w:tblPr>
+        <w:tblW w:type="auto" w:w="0"/>
+        <w:jc w:val="center"/>
+        <w:tblLayout w:type="fixed"/>
+        <w:tblLook w:firstColumn="1" w:firstRow="1" w:lastColumn="0" w:lastRow="0" w:noHBand="0" w:noVBand="1" w:val="04A0"/>
+      </w:tblPr>
+      <w:tblGrid>
+        <w:gridCol w:w="9878"/>
+      </w:tblGrid>
+      <w:tr>
+        <w:trPr>
+          <w:tblHeader w:val="true"/>
+        </w:trPr>
+        <w:tc>
+          <w:tcPr>
+            <w:tcW w:type="dxa" w:w="9576"/>
+            <w:shd w:fill="FEF3C7"/>
+            <w:vAlign w:val="center"/>
+          </w:tcPr>
+          <w:p>
+            <w:pPr>
+              <w:spacing w:after="40"/>
+            </w:pPr>
+            <w:r>
+              <w:rPr>
+                <w:rFonts w:ascii="Kanit" w:hAnsi="Kanit" w:eastAsia="Kanit" w:cs="Kanit"/>
+                <w:b/>
+                <w:color w:val="92400E"/>
+              </w:rPr>
+              <w:t>ข้อจำกัดของ LINE</w:t>
+            </w:r>
+          </w:p>
+          <w:p>
+            <w:pPr>
+              <w:spacing w:after="0"/>
+            </w:pPr>
+            <w:r>
+              <w:rPr>
+                <w:rFonts w:ascii="Kanit" w:hAnsi="Kanit" w:eastAsia="Kanit" w:cs="Kanit"/>
+              </w:rPr>
+              <w:t>Messaging API ดึงรายการ Rich Menu ได้เฉพาะเมนูที่สร้างผ่าน Messaging API เท่านั้น เมนูที่สร้างใน LINE Official Account Manager อาจดึงไม่ได้ หากระบบแจ้งว่าไม่พบลิงก์ ให้ตรวจแหล่งที่สร้างเมนูและเพิ่ม URL ใน Master Data ด้วยตนเอง</w:t>
+            </w:r>
+          </w:p>
+        </w:tc>
+      </w:tr>
+    </w:tbl>
+    <w:p>
+      <w:pPr>
+        <w:spacing w:after="0"/>
+      </w:pPr>
+    </w:p>
+    <w:tbl>
+      <w:tblPr>
+        <w:tblW w:type="auto" w:w="0"/>
+        <w:jc w:val="center"/>
+        <w:tblLayout w:type="fixed"/>
+        <w:tblLook w:firstColumn="1" w:firstRow="1" w:lastColumn="0" w:lastRow="0" w:noHBand="0" w:noVBand="1" w:val="04A0"/>
+      </w:tblPr>
+      <w:tblGrid>
+        <w:gridCol w:w="9878"/>
+      </w:tblGrid>
+      <w:tr>
+        <w:trPr>
+          <w:tblHeader w:val="true"/>
+        </w:trPr>
+        <w:tc>
+          <w:tcPr>
+            <w:tcW w:type="dxa" w:w="9576"/>
+            <w:shd w:fill="FEE2E2"/>
+            <w:vAlign w:val="center"/>
+          </w:tcPr>
+          <w:p>
+            <w:pPr>
+              <w:spacing w:after="40"/>
+            </w:pPr>
+            <w:r>
+              <w:rPr>
+                <w:rFonts w:ascii="Kanit" w:hAnsi="Kanit" w:eastAsia="Kanit" w:cs="Kanit"/>
+                <w:b/>
+                <w:color w:val="DC2626"/>
+              </w:rPr>
+              <w:t>รักษา Token ให้ปลอดภัย</w:t>
+            </w:r>
+          </w:p>
+          <w:p>
+            <w:pPr>
+              <w:spacing w:after="0"/>
+            </w:pPr>
+            <w:r>
+              <w:rPr>
+                <w:rFonts w:ascii="Kanit" w:hAnsi="Kanit" w:eastAsia="Kanit" w:cs="Kanit"/>
+              </w:rPr>
+              <w:t>Channel Access Token มีสิทธิ์เรียก Messaging API ห้ามส่งในกลุ่มหรือแนบในภาพหน้าจอ หากสงสัยว่ารั่วให้ revoke หรือออก token ใหม่ใน LINE Developers Console</w:t>
+            </w:r>
+          </w:p>
+        </w:tc>
+      </w:tr>
+    </w:tbl>
+    <w:p>
+      <w:pPr>
+        <w:spacing w:after="0"/>
+      </w:pPr>
+    </w:p>
+    <w:p>
+      <w:pPr>
         <w:pStyle w:val="Heading1"/>
         <w:pageBreakBefore/>
       </w:pPr>
@@ -2563,6 +2744,35 @@
           </w:p>
         </w:tc>
       </w:tr>
+      <w:tr>
+        <w:tc>
+          <w:tcPr>
+            <w:tcW w:type="dxa" w:w="3096"/>
+          </w:tcPr>
+          <w:p>
+            <w:r>
+              <w:rPr>
+                <w:rFonts w:ascii="Kanit" w:hAnsi="Kanit" w:eastAsia="Kanit" w:cs="Kanit"/>
+                <w:b/>
+              </w:rPr>
+              <w:t>ดึง Rich Menu ไม่ได้</w:t>
+            </w:r>
+          </w:p>
+        </w:tc>
+        <w:tc>
+          <w:tcPr>
+            <w:tcW w:type="dxa" w:w="6480"/>
+          </w:tcPr>
+          <w:p>
+            <w:r>
+              <w:rPr>
+                <w:rFonts w:ascii="Kanit" w:hAnsi="Kanit" w:eastAsia="Kanit" w:cs="Kanit"/>
+              </w:rPr>
+              <w:t>บันทึก Channel Access Token ก่อน ตรวจว่าเป็น Messaging API channel และเมนูถูกสร้างผ่าน Messaging API; เมนูจาก OA Manager อาจดึงผ่าน API ไม่ได้</w:t>
+            </w:r>
+          </w:p>
+        </w:tc>
+      </w:tr>
     </w:tbl>
     <w:p>
       <w:pPr>
@@ -2606,6 +2816,17 @@
           <w:rFonts w:ascii="Kanit" w:hAnsi="Kanit" w:eastAsia="Kanit" w:cs="Kanit"/>
         </w:rPr>
         <w:t>เพิ่ม/แก้ไข/พักเฝ้าดูลิงก์ และตรวจว่าประวัติยังอยู่</w:t>
+      </w:r>
+    </w:p>
+    <w:p>
+      <w:pPr>
+        <w:pStyle w:val="ListBullet"/>
+      </w:pPr>
+      <w:r>
+        <w:rPr>
+          <w:rFonts w:ascii="Kanit" w:hAnsi="Kanit" w:eastAsia="Kanit" w:cs="Kanit"/>
+        </w:rPr>
+        <w:t>ตรวจ LINE OA ด้วย token ทดสอบดึง Rich Menu และตรวจว่า URL ซ้ำไม่ถูกสร้างเพิ่ม</w:t>
       </w:r>
     </w:p>
     <w:p>

</xml_diff>